<commit_message>
Update Ronald Dillon career portfolio
</commit_message>
<xml_diff>
--- a/Ron_Dillon_Career_Portfolio_A.docx
+++ b/Ron_Dillon_Career_Portfolio_A.docx
@@ -13,7 +13,7 @@
           <w:color w:val="142A43"/>
           <w:sz w:val="56"/>
         </w:rPr>
-        <w:t>RON DILLON</w:t>
+        <w:t>RONALD DILLON</w:t>
       </w:r>
     </w:p>
     <w:p>
@@ -103,7 +103,7 @@
                 <w:color w:val="FFFFFF"/>
                 <w:sz w:val="28"/>
               </w:rPr>
-              <w:t>30+</w:t>
+              <w:t>15+</w:t>
             </w:r>
           </w:p>
           <w:p>
@@ -265,7 +265,7 @@
         <w:rPr>
           <w:color w:val="232323"/>
         </w:rPr>
-        <w:t>Principal-level enterprise customer success and technical advisory leader with 30+ years helping complex organizations turn technology into trusted operating workflows. Experience spans executive relationships, SaaS implementation, adoption, training, product advocacy, renewal-risk recovery, and cross-functional delivery.</w:t>
+        <w:t>Principal-level enterprise customer success and technical advisory leader with 15+ years helping complex organizations turn technology into trusted operating workflows. Experience spans executive relationships, SaaS implementation, adoption, training, product advocacy, renewal-risk recovery, and cross-functional delivery.</w:t>
       </w:r>
     </w:p>
     <w:p>
@@ -5677,7 +5677,7 @@
         <w:rPr>
           <w:color w:val="232323"/>
         </w:rPr>
-        <w:t>Latitude Compass Award</w:t>
+        <w:t>Cisco Compass Award</w:t>
       </w:r>
     </w:p>
     <w:p>
@@ -5748,7 +5748,7 @@
         <w:rPr>
           <w:color w:val="232323"/>
         </w:rPr>
-        <w:t>Salesforce certification in progress</w:t>
+        <w:t>Salesforce Trailhead training in progress</w:t>
       </w:r>
     </w:p>
     <w:p>
@@ -6180,6 +6180,7 @@
     </w:p>
     <w:sectPr>
       <w:footerReference w:type="default" r:id="rId8"/>
+      <w:headerReference w:type="default" r:id="rId11"/>
       <w:pgSz w:w="12240" w:h="15840"/>
       <w:pgMar w:top="893" w:right="1181" w:bottom="835" w:left="1181" w:header="504" w:footer="504" w:gutter="0"/>
       <w:cols w:space="720"/>
@@ -6226,7 +6227,7 @@
         <w:color w:val="5C626C"/>
         <w:sz w:val="17"/>
       </w:rPr>
-      <w:t>Ron Dillon Career Portfolio | Enterprise Customer Success, Technical Advisory &amp; SaaS Adoption</w:t>
+      <w:t>Ronald Dillon Career Portfolio | Enterprise Customer Success, Technical Advisory &amp; SaaS Adoption</w:t>
     </w:r>
   </w:p>
 </w:ftr>
@@ -6255,6 +6256,16 @@
     </w:p>
   </w:footnote>
 </w:footnotes>
+</file>
+
+<file path=word/header1.xml><?xml version="1.0" encoding="utf-8"?>
+<w:hdr xmlns:m="http://schemas.openxmlformats.org/officeDocument/2006/math" xmlns:mc="http://schemas.openxmlformats.org/markup-compatibility/2006" xmlns:mo="http://schemas.microsoft.com/office/mac/office/2008/main" xmlns:mv="urn:schemas-microsoft-com:mac:vml" xmlns:o="urn:schemas-microsoft-com:office:office" xmlns:r="http://schemas.openxmlformats.org/officeDocument/2006/relationships" xmlns:v="urn:schemas-microsoft-com:vml" xmlns:w10="urn:schemas-microsoft-com:office:word" xmlns:w14="http://schemas.microsoft.com/office/word/2010/wordml" xmlns:w="http://schemas.openxmlformats.org/wordprocessingml/2006/main" xmlns:wne="http://schemas.microsoft.com/office/word/2006/wordml" xmlns:wp14="http://schemas.microsoft.com/office/word/2010/wordprocessingDrawing" xmlns:wp="http://schemas.openxmlformats.org/drawingml/2006/wordprocessingDrawing" xmlns:wpc="http://schemas.microsoft.com/office/word/2010/wordprocessingCanvas" xmlns:wpg="http://schemas.microsoft.com/office/word/2010/wordprocessingGroup" xmlns:wpi="http://schemas.microsoft.com/office/word/2010/wordprocessingInk" xmlns:wps="http://schemas.microsoft.com/office/word/2010/wordprocessingShape" mc:Ignorable="w14 wp14">
+  <w:p>
+    <w:pPr>
+      <w:pStyle w:val="Header"/>
+    </w:pPr>
+  </w:p>
+</w:hdr>
 </file>
 
 <file path=word/numbering.xml><?xml version="1.0" encoding="utf-8"?>

</xml_diff>

<commit_message>
Enhance career portfolio with technical customer success profile
</commit_message>
<xml_diff>
--- a/Ron_Dillon_Career_Portfolio_A.docx
+++ b/Ron_Dillon_Career_Portfolio_A.docx
@@ -6178,6 +6178,465 @@
         <w:ind w:left="360"/>
       </w:pPr>
     </w:p>
+    <w:p>
+      <w:r>
+        <w:br w:type="page"/>
+      </w:r>
+    </w:p>
+    <w:p>
+      <w:pPr>
+        <w:spacing w:after="120" w:line="264" w:lineRule="auto"/>
+      </w:pPr>
+      <w:r>
+        <w:rPr>
+          <w:b/>
+          <w:color w:val="2E74B5"/>
+          <w:sz w:val="32"/>
+        </w:rPr>
+        <w:t>TECHNICAL CUSTOMER SUCCESS AND DEVELOPER EXPERIENCE</w:t>
+      </w:r>
+    </w:p>
+    <w:p>
+      <w:pPr>
+        <w:spacing w:after="160" w:line="264" w:lineRule="auto"/>
+      </w:pPr>
+      <w:r>
+        <w:rPr>
+          <w:color w:val="5C626C"/>
+        </w:rPr>
+        <w:t>This profile complements the broader customer-success portfolio with hands-on technical context for developer experience, technical customer success, implementation, and technical account management roles.</w:t>
+      </w:r>
+    </w:p>
+    <w:tbl>
+      <w:tblPr>
+        <w:tblW w:w="9360" w:type="dxa"/>
+        <w:jc w:val="center"/>
+        <w:tblBorders>
+          <w:top w:val="single" w:sz="6" w:space="0" w:color="D8DEE8"/>
+          <w:left w:val="single" w:sz="6" w:space="0" w:color="D8DEE8"/>
+          <w:bottom w:val="single" w:sz="6" w:space="0" w:color="D8DEE8"/>
+          <w:right w:val="single" w:sz="6" w:space="0" w:color="D8DEE8"/>
+          <w:insideH w:val="single" w:sz="6" w:space="0" w:color="D8DEE8"/>
+          <w:insideV w:val="single" w:sz="6" w:space="0" w:color="D8DEE8"/>
+        </w:tblBorders>
+        <w:tblLayout w:type="fixed"/>
+        <w:tblLook w:val="04A0" w:firstRow="1" w:lastRow="0" w:firstColumn="1" w:lastColumn="0" w:noHBand="0" w:noVBand="1"/>
+      </w:tblPr>
+      <w:tblGrid>
+        <w:gridCol w:w="1858"/>
+        <w:gridCol w:w="7502"/>
+      </w:tblGrid>
+      <w:tr>
+        <w:trPr>
+          <w:jc w:val="center"/>
+        </w:trPr>
+        <w:tc>
+          <w:tcPr>
+            <w:tcW w:w="9878" w:type="dxa"/>
+            <w:gridSpan w:val="2"/>
+            <w:shd w:val="clear" w:color="auto" w:fill="E8EEF7"/>
+            <w:tcMar>
+              <w:top w:w="100" w:type="dxa"/>
+              <w:left w:w="140" w:type="dxa"/>
+              <w:bottom w:w="100" w:type="dxa"/>
+              <w:right w:w="140" w:type="dxa"/>
+            </w:tcMar>
+            <w:vAlign w:val="center"/>
+          </w:tcPr>
+          <w:p>
+            <w:pPr>
+              <w:spacing w:after="0" w:line="252" w:lineRule="auto"/>
+            </w:pPr>
+            <w:r>
+              <w:rPr>
+                <w:b/>
+                <w:color w:val="142A43"/>
+              </w:rPr>
+              <w:t>Technical Customer Success Profile</w:t>
+            </w:r>
+          </w:p>
+        </w:tc>
+      </w:tr>
+      <w:tr>
+        <w:trPr>
+          <w:jc w:val="center"/>
+        </w:trPr>
+        <w:tc>
+          <w:tcPr>
+            <w:tcW w:w="1950" w:type="dxa"/>
+            <w:shd w:val="clear" w:color="auto" w:fill="F5F7FA"/>
+            <w:tcMar>
+              <w:top w:w="100" w:type="dxa"/>
+              <w:left w:w="140" w:type="dxa"/>
+              <w:bottom w:w="100" w:type="dxa"/>
+              <w:right w:w="140" w:type="dxa"/>
+            </w:tcMar>
+            <w:vAlign w:val="center"/>
+          </w:tcPr>
+          <w:p>
+            <w:pPr>
+              <w:spacing w:after="0" w:line="252" w:lineRule="auto"/>
+            </w:pPr>
+            <w:r>
+              <w:rPr>
+                <w:b/>
+                <w:color w:val="142A43"/>
+                <w:sz w:val="18"/>
+              </w:rPr>
+              <w:t>Technical Fluency</w:t>
+            </w:r>
+          </w:p>
+        </w:tc>
+        <w:tc>
+          <w:tcPr>
+            <w:tcW w:w="7410" w:type="dxa"/>
+            <w:tcMar>
+              <w:top w:w="100" w:type="dxa"/>
+              <w:left w:w="140" w:type="dxa"/>
+              <w:bottom w:w="100" w:type="dxa"/>
+              <w:right w:w="140" w:type="dxa"/>
+            </w:tcMar>
+            <w:vAlign w:val="center"/>
+          </w:tcPr>
+          <w:p>
+            <w:pPr>
+              <w:spacing w:after="0" w:line="252" w:lineRule="auto"/>
+            </w:pPr>
+            <w:r>
+              <w:rPr>
+                <w:color w:val="232323"/>
+                <w:sz w:val="18"/>
+              </w:rPr>
+              <w:t>Command line practitioner; Git and GitHub commit/push workflows; JSON interrogation; OpenAPI and Swagger familiarity; HTML, CSS, and JavaScript web customization.</w:t>
+            </w:r>
+          </w:p>
+        </w:tc>
+      </w:tr>
+      <w:tr>
+        <w:trPr>
+          <w:jc w:val="center"/>
+        </w:trPr>
+        <w:tc>
+          <w:tcPr>
+            <w:tcW w:w="1950" w:type="dxa"/>
+            <w:shd w:val="clear" w:color="auto" w:fill="F5F7FA"/>
+            <w:tcMar>
+              <w:top w:w="100" w:type="dxa"/>
+              <w:left w:w="140" w:type="dxa"/>
+              <w:bottom w:w="100" w:type="dxa"/>
+              <w:right w:w="140" w:type="dxa"/>
+            </w:tcMar>
+            <w:vAlign w:val="center"/>
+          </w:tcPr>
+          <w:p>
+            <w:pPr>
+              <w:spacing w:after="0" w:line="252" w:lineRule="auto"/>
+            </w:pPr>
+            <w:r>
+              <w:rPr>
+                <w:b/>
+                <w:color w:val="142A43"/>
+                <w:sz w:val="18"/>
+              </w:rPr>
+              <w:t>Authentication and Provisioning</w:t>
+            </w:r>
+          </w:p>
+        </w:tc>
+        <w:tc>
+          <w:tcPr>
+            <w:tcW w:w="7410" w:type="dxa"/>
+            <w:tcMar>
+              <w:top w:w="100" w:type="dxa"/>
+              <w:left w:w="140" w:type="dxa"/>
+              <w:bottom w:w="100" w:type="dxa"/>
+              <w:right w:w="140" w:type="dxa"/>
+            </w:tcMar>
+            <w:vAlign w:val="center"/>
+          </w:tcPr>
+          <w:p>
+            <w:pPr>
+              <w:spacing w:after="0" w:line="252" w:lineRule="auto"/>
+            </w:pPr>
+            <w:r>
+              <w:rPr>
+                <w:color w:val="232323"/>
+                <w:sz w:val="18"/>
+              </w:rPr>
+              <w:t>Multi-domain Active Directory, authentication, provisioning, user propagation, secure environments, and technical working sessions with customer teams.</w:t>
+            </w:r>
+          </w:p>
+        </w:tc>
+      </w:tr>
+      <w:tr>
+        <w:trPr>
+          <w:jc w:val="center"/>
+        </w:trPr>
+        <w:tc>
+          <w:tcPr>
+            <w:tcW w:w="1950" w:type="dxa"/>
+            <w:shd w:val="clear" w:color="auto" w:fill="F5F7FA"/>
+            <w:tcMar>
+              <w:top w:w="100" w:type="dxa"/>
+              <w:left w:w="140" w:type="dxa"/>
+              <w:bottom w:w="100" w:type="dxa"/>
+              <w:right w:w="140" w:type="dxa"/>
+            </w:tcMar>
+            <w:vAlign w:val="center"/>
+          </w:tcPr>
+          <w:p>
+            <w:pPr>
+              <w:spacing w:after="0" w:line="252" w:lineRule="auto"/>
+            </w:pPr>
+            <w:r>
+              <w:rPr>
+                <w:b/>
+                <w:color w:val="142A43"/>
+                <w:sz w:val="18"/>
+              </w:rPr>
+              <w:t>Documentation and Enablement</w:t>
+            </w:r>
+          </w:p>
+        </w:tc>
+        <w:tc>
+          <w:tcPr>
+            <w:tcW w:w="7410" w:type="dxa"/>
+            <w:tcMar>
+              <w:top w:w="100" w:type="dxa"/>
+              <w:left w:w="140" w:type="dxa"/>
+              <w:bottom w:w="100" w:type="dxa"/>
+              <w:right w:w="140" w:type="dxa"/>
+            </w:tcMar>
+            <w:vAlign w:val="center"/>
+          </w:tcPr>
+          <w:p>
+            <w:pPr>
+              <w:spacing w:after="0" w:line="252" w:lineRule="auto"/>
+            </w:pPr>
+            <w:r>
+              <w:rPr>
+                <w:color w:val="232323"/>
+                <w:sz w:val="18"/>
+              </w:rPr>
+              <w:t>Created Project Management, Training, Onboarding, Rollout, and Implementation Guides designed to work for both technical and nontechnical audiences.</w:t>
+            </w:r>
+          </w:p>
+        </w:tc>
+      </w:tr>
+      <w:tr>
+        <w:trPr>
+          <w:jc w:val="center"/>
+        </w:trPr>
+        <w:tc>
+          <w:tcPr>
+            <w:tcW w:w="1950" w:type="dxa"/>
+            <w:shd w:val="clear" w:color="auto" w:fill="F5F7FA"/>
+            <w:tcMar>
+              <w:top w:w="100" w:type="dxa"/>
+              <w:left w:w="140" w:type="dxa"/>
+              <w:bottom w:w="100" w:type="dxa"/>
+              <w:right w:w="140" w:type="dxa"/>
+            </w:tcMar>
+            <w:vAlign w:val="center"/>
+          </w:tcPr>
+          <w:p>
+            <w:pPr>
+              <w:spacing w:after="0" w:line="252" w:lineRule="auto"/>
+            </w:pPr>
+            <w:r>
+              <w:rPr>
+                <w:b/>
+                <w:color w:val="142A43"/>
+                <w:sz w:val="18"/>
+              </w:rPr>
+              <w:t>AI and Data Workflow</w:t>
+            </w:r>
+          </w:p>
+        </w:tc>
+        <w:tc>
+          <w:tcPr>
+            <w:tcW w:w="7410" w:type="dxa"/>
+            <w:tcMar>
+              <w:top w:w="100" w:type="dxa"/>
+              <w:left w:w="140" w:type="dxa"/>
+              <w:bottom w:w="100" w:type="dxa"/>
+              <w:right w:w="140" w:type="dxa"/>
+            </w:tcMar>
+            <w:vAlign w:val="center"/>
+          </w:tcPr>
+          <w:p>
+            <w:pPr>
+              <w:spacing w:after="0" w:line="252" w:lineRule="auto"/>
+            </w:pPr>
+            <w:r>
+              <w:rPr>
+                <w:color w:val="232323"/>
+                <w:sz w:val="18"/>
+              </w:rPr>
+              <w:t>Designed FFID's AI-assisted discovery workflow to turn flat House and Senate funding data into rapidly accessible funded and potentially funded opportunities.</w:t>
+            </w:r>
+          </w:p>
+        </w:tc>
+      </w:tr>
+      <w:tr>
+        <w:trPr>
+          <w:jc w:val="center"/>
+        </w:trPr>
+        <w:tc>
+          <w:tcPr>
+            <w:tcW w:w="1950" w:type="dxa"/>
+            <w:shd w:val="clear" w:color="auto" w:fill="F5F7FA"/>
+            <w:tcMar>
+              <w:top w:w="100" w:type="dxa"/>
+              <w:left w:w="140" w:type="dxa"/>
+              <w:bottom w:w="100" w:type="dxa"/>
+              <w:right w:w="140" w:type="dxa"/>
+            </w:tcMar>
+            <w:vAlign w:val="center"/>
+          </w:tcPr>
+          <w:p>
+            <w:pPr>
+              <w:spacing w:after="0" w:line="252" w:lineRule="auto"/>
+            </w:pPr>
+            <w:r>
+              <w:rPr>
+                <w:b/>
+                <w:color w:val="142A43"/>
+                <w:sz w:val="18"/>
+              </w:rPr>
+              <w:t>Customer Ownership</w:t>
+            </w:r>
+          </w:p>
+        </w:tc>
+        <w:tc>
+          <w:tcPr>
+            <w:tcW w:w="7410" w:type="dxa"/>
+            <w:tcMar>
+              <w:top w:w="100" w:type="dxa"/>
+              <w:left w:w="140" w:type="dxa"/>
+              <w:bottom w:w="100" w:type="dxa"/>
+              <w:right w:w="140" w:type="dxa"/>
+            </w:tcMar>
+            <w:vAlign w:val="center"/>
+          </w:tcPr>
+          <w:p>
+            <w:pPr>
+              <w:spacing w:after="0" w:line="252" w:lineRule="auto"/>
+            </w:pPr>
+            <w:r>
+              <w:rPr>
+                <w:color w:val="232323"/>
+                <w:sz w:val="18"/>
+              </w:rPr>
+              <w:t>Directly managed up to 20 enterprise accounts through implementation, adoption, QBRs, escalations, executive alignment, renewal readiness, and expansion discovery.</w:t>
+            </w:r>
+          </w:p>
+        </w:tc>
+      </w:tr>
+      <w:tr>
+        <w:trPr>
+          <w:jc w:val="center"/>
+        </w:trPr>
+        <w:tc>
+          <w:tcPr>
+            <w:tcW w:w="1950" w:type="dxa"/>
+            <w:shd w:val="clear" w:color="auto" w:fill="F5F7FA"/>
+            <w:tcMar>
+              <w:top w:w="100" w:type="dxa"/>
+              <w:left w:w="140" w:type="dxa"/>
+              <w:bottom w:w="100" w:type="dxa"/>
+              <w:right w:w="140" w:type="dxa"/>
+            </w:tcMar>
+            <w:vAlign w:val="center"/>
+          </w:tcPr>
+          <w:p>
+            <w:pPr>
+              <w:spacing w:after="0" w:line="252" w:lineRule="auto"/>
+            </w:pPr>
+            <w:r>
+              <w:rPr>
+                <w:b/>
+                <w:color w:val="142A43"/>
+                <w:sz w:val="18"/>
+              </w:rPr>
+              <w:t>Operating Range</w:t>
+            </w:r>
+          </w:p>
+        </w:tc>
+        <w:tc>
+          <w:tcPr>
+            <w:tcW w:w="7410" w:type="dxa"/>
+            <w:tcMar>
+              <w:top w:w="100" w:type="dxa"/>
+              <w:left w:w="140" w:type="dxa"/>
+              <w:bottom w:w="100" w:type="dxa"/>
+              <w:right w:w="140" w:type="dxa"/>
+            </w:tcMar>
+            <w:vAlign w:val="center"/>
+          </w:tcPr>
+          <w:p>
+            <w:pPr>
+              <w:spacing w:after="0" w:line="252" w:lineRule="auto"/>
+            </w:pPr>
+            <w:r>
+              <w:rPr>
+                <w:color w:val="232323"/>
+                <w:sz w:val="18"/>
+              </w:rPr>
+              <w:t>Remote-first; willing to travel up to 40%; principal- or senior-level individual contributor.</w:t>
+            </w:r>
+          </w:p>
+        </w:tc>
+      </w:tr>
+    </w:tbl>
+    <w:p>
+      <w:pPr>
+        <w:spacing w:after="120" w:line="264" w:lineRule="auto"/>
+      </w:pPr>
+      <w:r>
+        <w:rPr>
+          <w:b/>
+          <w:color w:val="2E74B5"/>
+          <w:sz w:val="32"/>
+        </w:rPr>
+        <w:t>PROOF IN PRACTICE</w:t>
+      </w:r>
+    </w:p>
+    <w:p>
+      <w:pPr>
+        <w:pStyle w:val="ListBullet"/>
+        <w:spacing w:after="60" w:line="259" w:lineRule="auto"/>
+      </w:pPr>
+      <w:r>
+        <w:rPr>
+          <w:color w:val="232323"/>
+        </w:rPr>
+        <w:t>Cisco and Verizon: Led multi-domain identity integration for authentication, provisioning, and user propagation while translating technical dependencies into customer-facing progress, risk, and adoption plans.</w:t>
+      </w:r>
+    </w:p>
+    <w:p>
+      <w:pPr>
+        <w:pStyle w:val="ListBullet"/>
+        <w:spacing w:after="60" w:line="259" w:lineRule="auto"/>
+      </w:pPr>
+      <w:r>
+        <w:rPr>
+          <w:color w:val="232323"/>
+        </w:rPr>
+        <w:t>FFID: Built a public-funding intelligence workflow that combines AI-assisted discovery, search, gated access, billing, analytics, CSV export, and browser-level usability improvements.</w:t>
+      </w:r>
+    </w:p>
+    <w:p>
+      <w:pPr>
+        <w:pStyle w:val="ListBullet"/>
+        <w:spacing w:after="60" w:line="259" w:lineRule="auto"/>
+      </w:pPr>
+      <w:r>
+        <w:rPr>
+          <w:color w:val="232323"/>
+        </w:rPr>
+        <w:t>Latitude and Cisco: Turned repeated customer lessons into practical delivery guides and enablement materials because documentation must help people act, not merely describe a product.</w:t>
+      </w:r>
+    </w:p>
     <w:sectPr>
       <w:footerReference w:type="default" r:id="rId8"/>
       <w:headerReference w:type="default" r:id="rId11"/>

</xml_diff>